<commit_message>
docs: reconcile governing docs to June canonical set
</commit_message>
<xml_diff>
--- a/docs/Oros - CKM Data Readiness - Data Model.docx
+++ b/docs/Oros - CKM Data Readiness - Data Model.docx
@@ -31551,7 +31551,7 @@
         <w:spacing w:before="80" w:after="80"/>
       </w:pPr>
       <w:r>
-        <w:t>All cross-table foreign keys are session-aware composite constraints referencing both the entity ID and demo_session_id. This enforces that every record belongs to an entity within the same demo session.</w:t>
+        <w:t>Foreign keys in this schema follow two complementary session-aware patterns. Every session-scoped table carries both where applicable:</w:t>
       </w:r>
     </w:p>
     <w:p>
@@ -31564,7 +31564,33 @@
         <w:spacing w:before="80" w:after="80"/>
       </w:pPr>
       <w:r>
-        <w:t>Example: encounters.fk_encounters_patient references (patient_id, demo_session_id) → patients(patient_id, demo_session_id).</w:t>
+        <w:t xml:space="preserve">(1) Direct session FK. Every table with a demo_session_id column carries a direct FK from that column to demo_sessions(session_id). This enforces session membership at the DB layer independent of entity relationships, supports CASCADE on session deletion, and allows session-level operations (reset, audit) to act on the session table directly. Every table in the schema from Tier 1 through Tier 4 follows this pattern, including use_case_pathway_results (added in V010).</w:t>
+      </w:r>
+    </w:p>
+    <w:p>
+      <w:pPr>
+        <w:spacing w:before="80" w:after="80"/>
+      </w:pPr>
+    </w:p>
+    <w:p>
+      <w:pPr>
+        <w:spacing w:before="80" w:after="80"/>
+      </w:pPr>
+      <w:r>
+        <w:t xml:space="preserve">(2) Composite entity FK. Tables that reference an entity in another table additionally carry a composite FK referencing both the entity ID and demo_session_id together, pointing at a corresponding composite UNIQUE on the parent table. This enforces that every record belongs to an entity within the same demo session. Example: encounters.fk_encounters_patient references (patient_id, demo_session_id) → patients(patient_id, demo_session_id).</w:t>
+      </w:r>
+    </w:p>
+    <w:p>
+      <w:pPr>
+        <w:spacing w:before="80" w:after="80"/>
+      </w:pPr>
+    </w:p>
+    <w:p>
+      <w:pPr>
+        <w:spacing w:before="80" w:after="80"/>
+      </w:pPr>
+      <w:r>
+        <w:t>Tier 1 raw tables (other than patients) carry composite entity FKs to patients via this pattern. Tier 3 and Tier 4 tables carry composite entity FKs to patients and, where applicable, to other entities. cgm_readings is the documented exception below: it carries only the direct session FK, with no composite entity FK to patients, by design.</w:t>
       </w:r>
     </w:p>
     <w:p>

</xml_diff>